<commit_message>
docs(requisitos): republicar baseline institucional v1.1
</commit_message>
<xml_diff>
--- a/Documentos/Requisitos/05_Matriz_Rastreabilidade_Requisitos_Jornada_v1.1.docx
+++ b/Documentos/Requisitos/05_Matriz_Rastreabilidade_Requisitos_Jornada_v1.1.docx
@@ -5,6 +5,7 @@
     <w:p>
       <w:pPr>
         <w:pStyle w:val="Heading1"/>
+        <w:keepNext/>
       </w:pPr>
       <w:r>
         <w:rPr>
@@ -168,6 +169,7 @@
     <w:p>
       <w:pPr>
         <w:pStyle w:val="Heading2"/>
+        <w:keepNext/>
       </w:pPr>
       <w:r>
         <w:rPr>
@@ -194,6 +196,7 @@
       <w:tr>
         <w:trPr>
           <w:tblHeader w:val="true"/>
+          <w:cantSplit w:val="true"/>
         </w:trPr>
         <w:tc>
           <w:tcPr>
@@ -322,6 +325,9 @@
         </w:tc>
       </w:tr>
       <w:tr>
+        <w:trPr>
+          <w:cantSplit w:val="true"/>
+        </w:trPr>
         <w:tc>
           <w:tcPr>
             <w:tcW w:type="dxa" w:w="1360"/>
@@ -452,6 +458,9 @@
         </w:tc>
       </w:tr>
       <w:tr>
+        <w:trPr>
+          <w:cantSplit w:val="true"/>
+        </w:trPr>
         <w:tc>
           <w:tcPr>
             <w:tcW w:type="dxa" w:w="1360"/>
@@ -582,6 +591,9 @@
         </w:tc>
       </w:tr>
       <w:tr>
+        <w:trPr>
+          <w:cantSplit w:val="true"/>
+        </w:trPr>
         <w:tc>
           <w:tcPr>
             <w:tcW w:type="dxa" w:w="1360"/>
@@ -712,6 +724,9 @@
         </w:tc>
       </w:tr>
       <w:tr>
+        <w:trPr>
+          <w:cantSplit w:val="true"/>
+        </w:trPr>
         <w:tc>
           <w:tcPr>
             <w:tcW w:type="dxa" w:w="1360"/>
@@ -842,6 +857,9 @@
         </w:tc>
       </w:tr>
       <w:tr>
+        <w:trPr>
+          <w:cantSplit w:val="true"/>
+        </w:trPr>
         <w:tc>
           <w:tcPr>
             <w:tcW w:type="dxa" w:w="1360"/>
@@ -972,6 +990,9 @@
         </w:tc>
       </w:tr>
       <w:tr>
+        <w:trPr>
+          <w:cantSplit w:val="true"/>
+        </w:trPr>
         <w:tc>
           <w:tcPr>
             <w:tcW w:type="dxa" w:w="1360"/>
@@ -1102,6 +1123,9 @@
         </w:tc>
       </w:tr>
       <w:tr>
+        <w:trPr>
+          <w:cantSplit w:val="true"/>
+        </w:trPr>
         <w:tc>
           <w:tcPr>
             <w:tcW w:type="dxa" w:w="1360"/>
@@ -1232,6 +1256,9 @@
         </w:tc>
       </w:tr>
       <w:tr>
+        <w:trPr>
+          <w:cantSplit w:val="true"/>
+        </w:trPr>
         <w:tc>
           <w:tcPr>
             <w:tcW w:type="dxa" w:w="1360"/>
@@ -1362,6 +1389,9 @@
         </w:tc>
       </w:tr>
       <w:tr>
+        <w:trPr>
+          <w:cantSplit w:val="true"/>
+        </w:trPr>
         <w:tc>
           <w:tcPr>
             <w:tcW w:type="dxa" w:w="1360"/>
@@ -1492,6 +1522,9 @@
         </w:tc>
       </w:tr>
       <w:tr>
+        <w:trPr>
+          <w:cantSplit w:val="true"/>
+        </w:trPr>
         <w:tc>
           <w:tcPr>
             <w:tcW w:type="dxa" w:w="1360"/>
@@ -1622,6 +1655,9 @@
         </w:tc>
       </w:tr>
       <w:tr>
+        <w:trPr>
+          <w:cantSplit w:val="true"/>
+        </w:trPr>
         <w:tc>
           <w:tcPr>
             <w:tcW w:type="dxa" w:w="1360"/>
@@ -1752,6 +1788,9 @@
         </w:tc>
       </w:tr>
       <w:tr>
+        <w:trPr>
+          <w:cantSplit w:val="true"/>
+        </w:trPr>
         <w:tc>
           <w:tcPr>
             <w:tcW w:type="dxa" w:w="1360"/>
@@ -1882,6 +1921,9 @@
         </w:tc>
       </w:tr>
       <w:tr>
+        <w:trPr>
+          <w:cantSplit w:val="true"/>
+        </w:trPr>
         <w:tc>
           <w:tcPr>
             <w:tcW w:type="dxa" w:w="1360"/>
@@ -2012,6 +2054,9 @@
         </w:tc>
       </w:tr>
       <w:tr>
+        <w:trPr>
+          <w:cantSplit w:val="true"/>
+        </w:trPr>
         <w:tc>
           <w:tcPr>
             <w:tcW w:type="dxa" w:w="1360"/>
@@ -2142,6 +2187,9 @@
         </w:tc>
       </w:tr>
       <w:tr>
+        <w:trPr>
+          <w:cantSplit w:val="true"/>
+        </w:trPr>
         <w:tc>
           <w:tcPr>
             <w:tcW w:type="dxa" w:w="1360"/>
@@ -2272,6 +2320,9 @@
         </w:tc>
       </w:tr>
       <w:tr>
+        <w:trPr>
+          <w:cantSplit w:val="true"/>
+        </w:trPr>
         <w:tc>
           <w:tcPr>
             <w:tcW w:type="dxa" w:w="1360"/>
@@ -2402,6 +2453,9 @@
         </w:tc>
       </w:tr>
       <w:tr>
+        <w:trPr>
+          <w:cantSplit w:val="true"/>
+        </w:trPr>
         <w:tc>
           <w:tcPr>
             <w:tcW w:type="dxa" w:w="1360"/>
@@ -2532,6 +2586,9 @@
         </w:tc>
       </w:tr>
       <w:tr>
+        <w:trPr>
+          <w:cantSplit w:val="true"/>
+        </w:trPr>
         <w:tc>
           <w:tcPr>
             <w:tcW w:type="dxa" w:w="1360"/>
@@ -2662,6 +2719,9 @@
         </w:tc>
       </w:tr>
       <w:tr>
+        <w:trPr>
+          <w:cantSplit w:val="true"/>
+        </w:trPr>
         <w:tc>
           <w:tcPr>
             <w:tcW w:type="dxa" w:w="1360"/>
@@ -2792,6 +2852,9 @@
         </w:tc>
       </w:tr>
       <w:tr>
+        <w:trPr>
+          <w:cantSplit w:val="true"/>
+        </w:trPr>
         <w:tc>
           <w:tcPr>
             <w:tcW w:type="dxa" w:w="1360"/>
@@ -2922,6 +2985,9 @@
         </w:tc>
       </w:tr>
       <w:tr>
+        <w:trPr>
+          <w:cantSplit w:val="true"/>
+        </w:trPr>
         <w:tc>
           <w:tcPr>
             <w:tcW w:type="dxa" w:w="1360"/>
@@ -3052,6 +3118,9 @@
         </w:tc>
       </w:tr>
       <w:tr>
+        <w:trPr>
+          <w:cantSplit w:val="true"/>
+        </w:trPr>
         <w:tc>
           <w:tcPr>
             <w:tcW w:type="dxa" w:w="1360"/>
@@ -3182,6 +3251,9 @@
         </w:tc>
       </w:tr>
       <w:tr>
+        <w:trPr>
+          <w:cantSplit w:val="true"/>
+        </w:trPr>
         <w:tc>
           <w:tcPr>
             <w:tcW w:type="dxa" w:w="1360"/>
@@ -3312,6 +3384,9 @@
         </w:tc>
       </w:tr>
       <w:tr>
+        <w:trPr>
+          <w:cantSplit w:val="true"/>
+        </w:trPr>
         <w:tc>
           <w:tcPr>
             <w:tcW w:type="dxa" w:w="1360"/>
@@ -3442,6 +3517,9 @@
         </w:tc>
       </w:tr>
       <w:tr>
+        <w:trPr>
+          <w:cantSplit w:val="true"/>
+        </w:trPr>
         <w:tc>
           <w:tcPr>
             <w:tcW w:type="dxa" w:w="1360"/>
@@ -3572,6 +3650,9 @@
         </w:tc>
       </w:tr>
       <w:tr>
+        <w:trPr>
+          <w:cantSplit w:val="true"/>
+        </w:trPr>
         <w:tc>
           <w:tcPr>
             <w:tcW w:type="dxa" w:w="1360"/>
@@ -3702,6 +3783,9 @@
         </w:tc>
       </w:tr>
       <w:tr>
+        <w:trPr>
+          <w:cantSplit w:val="true"/>
+        </w:trPr>
         <w:tc>
           <w:tcPr>
             <w:tcW w:type="dxa" w:w="1360"/>
@@ -3832,6 +3916,9 @@
         </w:tc>
       </w:tr>
       <w:tr>
+        <w:trPr>
+          <w:cantSplit w:val="true"/>
+        </w:trPr>
         <w:tc>
           <w:tcPr>
             <w:tcW w:type="dxa" w:w="1360"/>
@@ -3962,6 +4049,9 @@
         </w:tc>
       </w:tr>
       <w:tr>
+        <w:trPr>
+          <w:cantSplit w:val="true"/>
+        </w:trPr>
         <w:tc>
           <w:tcPr>
             <w:tcW w:type="dxa" w:w="1360"/>
@@ -4092,6 +4182,9 @@
         </w:tc>
       </w:tr>
       <w:tr>
+        <w:trPr>
+          <w:cantSplit w:val="true"/>
+        </w:trPr>
         <w:tc>
           <w:tcPr>
             <w:tcW w:type="dxa" w:w="1360"/>
@@ -4222,6 +4315,9 @@
         </w:tc>
       </w:tr>
       <w:tr>
+        <w:trPr>
+          <w:cantSplit w:val="true"/>
+        </w:trPr>
         <w:tc>
           <w:tcPr>
             <w:tcW w:type="dxa" w:w="1360"/>
@@ -4352,6 +4448,9 @@
         </w:tc>
       </w:tr>
       <w:tr>
+        <w:trPr>
+          <w:cantSplit w:val="true"/>
+        </w:trPr>
         <w:tc>
           <w:tcPr>
             <w:tcW w:type="dxa" w:w="1360"/>
@@ -4482,6 +4581,9 @@
         </w:tc>
       </w:tr>
       <w:tr>
+        <w:trPr>
+          <w:cantSplit w:val="true"/>
+        </w:trPr>
         <w:tc>
           <w:tcPr>
             <w:tcW w:type="dxa" w:w="1360"/>
@@ -4612,6 +4714,9 @@
         </w:tc>
       </w:tr>
       <w:tr>
+        <w:trPr>
+          <w:cantSplit w:val="true"/>
+        </w:trPr>
         <w:tc>
           <w:tcPr>
             <w:tcW w:type="dxa" w:w="1360"/>
@@ -4742,6 +4847,9 @@
         </w:tc>
       </w:tr>
       <w:tr>
+        <w:trPr>
+          <w:cantSplit w:val="true"/>
+        </w:trPr>
         <w:tc>
           <w:tcPr>
             <w:tcW w:type="dxa" w:w="1360"/>
@@ -4872,6 +4980,9 @@
         </w:tc>
       </w:tr>
       <w:tr>
+        <w:trPr>
+          <w:cantSplit w:val="true"/>
+        </w:trPr>
         <w:tc>
           <w:tcPr>
             <w:tcW w:type="dxa" w:w="1360"/>
@@ -5010,6 +5121,7 @@
     <w:p>
       <w:pPr>
         <w:pStyle w:val="Heading2"/>
+        <w:keepNext/>
       </w:pPr>
       <w:r>
         <w:rPr>
@@ -5035,6 +5147,7 @@
       <w:tr>
         <w:trPr>
           <w:tblHeader w:val="true"/>
+          <w:cantSplit w:val="true"/>
         </w:trPr>
         <w:tc>
           <w:tcPr>
@@ -5138,6 +5251,9 @@
         </w:tc>
       </w:tr>
       <w:tr>
+        <w:trPr>
+          <w:cantSplit w:val="true"/>
+        </w:trPr>
         <w:tc>
           <w:tcPr>
             <w:tcW w:type="dxa" w:w="2834"/>
@@ -5236,6 +5352,9 @@
         </w:tc>
       </w:tr>
       <w:tr>
+        <w:trPr>
+          <w:cantSplit w:val="true"/>
+        </w:trPr>
         <w:tc>
           <w:tcPr>
             <w:tcW w:type="dxa" w:w="2834"/>
@@ -5334,6 +5453,9 @@
         </w:tc>
       </w:tr>
       <w:tr>
+        <w:trPr>
+          <w:cantSplit w:val="true"/>
+        </w:trPr>
         <w:tc>
           <w:tcPr>
             <w:tcW w:type="dxa" w:w="2834"/>
@@ -5432,6 +5554,9 @@
         </w:tc>
       </w:tr>
       <w:tr>
+        <w:trPr>
+          <w:cantSplit w:val="true"/>
+        </w:trPr>
         <w:tc>
           <w:tcPr>
             <w:tcW w:type="dxa" w:w="2834"/>
@@ -5530,6 +5655,9 @@
         </w:tc>
       </w:tr>
       <w:tr>
+        <w:trPr>
+          <w:cantSplit w:val="true"/>
+        </w:trPr>
         <w:tc>
           <w:tcPr>
             <w:tcW w:type="dxa" w:w="2834"/>
@@ -5628,6 +5756,9 @@
         </w:tc>
       </w:tr>
       <w:tr>
+        <w:trPr>
+          <w:cantSplit w:val="true"/>
+        </w:trPr>
         <w:tc>
           <w:tcPr>
             <w:tcW w:type="dxa" w:w="2834"/>
@@ -5726,6 +5857,9 @@
         </w:tc>
       </w:tr>
       <w:tr>
+        <w:trPr>
+          <w:cantSplit w:val="true"/>
+        </w:trPr>
         <w:tc>
           <w:tcPr>
             <w:tcW w:type="dxa" w:w="2834"/>
@@ -5824,6 +5958,9 @@
         </w:tc>
       </w:tr>
       <w:tr>
+        <w:trPr>
+          <w:cantSplit w:val="true"/>
+        </w:trPr>
         <w:tc>
           <w:tcPr>
             <w:tcW w:type="dxa" w:w="2834"/>
@@ -5922,6 +6059,9 @@
         </w:tc>
       </w:tr>
       <w:tr>
+        <w:trPr>
+          <w:cantSplit w:val="true"/>
+        </w:trPr>
         <w:tc>
           <w:tcPr>
             <w:tcW w:type="dxa" w:w="2834"/>
@@ -6020,6 +6160,9 @@
         </w:tc>
       </w:tr>
       <w:tr>
+        <w:trPr>
+          <w:cantSplit w:val="true"/>
+        </w:trPr>
         <w:tc>
           <w:tcPr>
             <w:tcW w:type="dxa" w:w="2834"/>
@@ -6118,6 +6261,9 @@
         </w:tc>
       </w:tr>
       <w:tr>
+        <w:trPr>
+          <w:cantSplit w:val="true"/>
+        </w:trPr>
         <w:tc>
           <w:tcPr>
             <w:tcW w:type="dxa" w:w="2834"/>
@@ -6216,6 +6362,9 @@
         </w:tc>
       </w:tr>
       <w:tr>
+        <w:trPr>
+          <w:cantSplit w:val="true"/>
+        </w:trPr>
         <w:tc>
           <w:tcPr>
             <w:tcW w:type="dxa" w:w="2834"/>
@@ -6314,6 +6463,9 @@
         </w:tc>
       </w:tr>
       <w:tr>
+        <w:trPr>
+          <w:cantSplit w:val="true"/>
+        </w:trPr>
         <w:tc>
           <w:tcPr>
             <w:tcW w:type="dxa" w:w="2834"/>
@@ -6412,6 +6564,9 @@
         </w:tc>
       </w:tr>
       <w:tr>
+        <w:trPr>
+          <w:cantSplit w:val="true"/>
+        </w:trPr>
         <w:tc>
           <w:tcPr>
             <w:tcW w:type="dxa" w:w="2834"/>
@@ -6510,6 +6665,9 @@
         </w:tc>
       </w:tr>
       <w:tr>
+        <w:trPr>
+          <w:cantSplit w:val="true"/>
+        </w:trPr>
         <w:tc>
           <w:tcPr>
             <w:tcW w:type="dxa" w:w="2834"/>
@@ -6608,6 +6766,9 @@
         </w:tc>
       </w:tr>
       <w:tr>
+        <w:trPr>
+          <w:cantSplit w:val="true"/>
+        </w:trPr>
         <w:tc>
           <w:tcPr>
             <w:tcW w:type="dxa" w:w="2834"/>
@@ -6706,6 +6867,9 @@
         </w:tc>
       </w:tr>
       <w:tr>
+        <w:trPr>
+          <w:cantSplit w:val="true"/>
+        </w:trPr>
         <w:tc>
           <w:tcPr>
             <w:tcW w:type="dxa" w:w="2834"/>
@@ -6804,6 +6968,9 @@
         </w:tc>
       </w:tr>
       <w:tr>
+        <w:trPr>
+          <w:cantSplit w:val="true"/>
+        </w:trPr>
         <w:tc>
           <w:tcPr>
             <w:tcW w:type="dxa" w:w="2834"/>
@@ -6902,6 +7069,9 @@
         </w:tc>
       </w:tr>
       <w:tr>
+        <w:trPr>
+          <w:cantSplit w:val="true"/>
+        </w:trPr>
         <w:tc>
           <w:tcPr>
             <w:tcW w:type="dxa" w:w="2834"/>
@@ -7000,6 +7170,9 @@
         </w:tc>
       </w:tr>
       <w:tr>
+        <w:trPr>
+          <w:cantSplit w:val="true"/>
+        </w:trPr>
         <w:tc>
           <w:tcPr>
             <w:tcW w:type="dxa" w:w="2834"/>
@@ -7098,6 +7271,9 @@
         </w:tc>
       </w:tr>
       <w:tr>
+        <w:trPr>
+          <w:cantSplit w:val="true"/>
+        </w:trPr>
         <w:tc>
           <w:tcPr>
             <w:tcW w:type="dxa" w:w="2834"/>
@@ -7196,6 +7372,9 @@
         </w:tc>
       </w:tr>
       <w:tr>
+        <w:trPr>
+          <w:cantSplit w:val="true"/>
+        </w:trPr>
         <w:tc>
           <w:tcPr>
             <w:tcW w:type="dxa" w:w="2834"/>
@@ -7294,6 +7473,9 @@
         </w:tc>
       </w:tr>
       <w:tr>
+        <w:trPr>
+          <w:cantSplit w:val="true"/>
+        </w:trPr>
         <w:tc>
           <w:tcPr>
             <w:tcW w:type="dxa" w:w="2834"/>
@@ -7392,6 +7574,9 @@
         </w:tc>
       </w:tr>
       <w:tr>
+        <w:trPr>
+          <w:cantSplit w:val="true"/>
+        </w:trPr>
         <w:tc>
           <w:tcPr>
             <w:tcW w:type="dxa" w:w="2834"/>
@@ -7490,6 +7675,9 @@
         </w:tc>
       </w:tr>
       <w:tr>
+        <w:trPr>
+          <w:cantSplit w:val="true"/>
+        </w:trPr>
         <w:tc>
           <w:tcPr>
             <w:tcW w:type="dxa" w:w="2834"/>
@@ -7588,6 +7776,9 @@
         </w:tc>
       </w:tr>
       <w:tr>
+        <w:trPr>
+          <w:cantSplit w:val="true"/>
+        </w:trPr>
         <w:tc>
           <w:tcPr>
             <w:tcW w:type="dxa" w:w="2834"/>
@@ -7686,6 +7877,9 @@
         </w:tc>
       </w:tr>
       <w:tr>
+        <w:trPr>
+          <w:cantSplit w:val="true"/>
+        </w:trPr>
         <w:tc>
           <w:tcPr>
             <w:tcW w:type="dxa" w:w="2834"/>
@@ -7784,6 +7978,9 @@
         </w:tc>
       </w:tr>
       <w:tr>
+        <w:trPr>
+          <w:cantSplit w:val="true"/>
+        </w:trPr>
         <w:tc>
           <w:tcPr>
             <w:tcW w:type="dxa" w:w="2834"/>
@@ -7882,6 +8079,9 @@
         </w:tc>
       </w:tr>
       <w:tr>
+        <w:trPr>
+          <w:cantSplit w:val="true"/>
+        </w:trPr>
         <w:tc>
           <w:tcPr>
             <w:tcW w:type="dxa" w:w="2834"/>
@@ -7980,6 +8180,9 @@
         </w:tc>
       </w:tr>
       <w:tr>
+        <w:trPr>
+          <w:cantSplit w:val="true"/>
+        </w:trPr>
         <w:tc>
           <w:tcPr>
             <w:tcW w:type="dxa" w:w="2834"/>
@@ -8078,6 +8281,9 @@
         </w:tc>
       </w:tr>
       <w:tr>
+        <w:trPr>
+          <w:cantSplit w:val="true"/>
+        </w:trPr>
         <w:tc>
           <w:tcPr>
             <w:tcW w:type="dxa" w:w="2834"/>
@@ -8176,6 +8382,9 @@
         </w:tc>
       </w:tr>
       <w:tr>
+        <w:trPr>
+          <w:cantSplit w:val="true"/>
+        </w:trPr>
         <w:tc>
           <w:tcPr>
             <w:tcW w:type="dxa" w:w="2834"/>
@@ -8274,6 +8483,9 @@
         </w:tc>
       </w:tr>
       <w:tr>
+        <w:trPr>
+          <w:cantSplit w:val="true"/>
+        </w:trPr>
         <w:tc>
           <w:tcPr>
             <w:tcW w:type="dxa" w:w="2834"/>
@@ -8372,6 +8584,9 @@
         </w:tc>
       </w:tr>
       <w:tr>
+        <w:trPr>
+          <w:cantSplit w:val="true"/>
+        </w:trPr>
         <w:tc>
           <w:tcPr>
             <w:tcW w:type="dxa" w:w="2834"/>
@@ -8470,6 +8685,9 @@
         </w:tc>
       </w:tr>
       <w:tr>
+        <w:trPr>
+          <w:cantSplit w:val="true"/>
+        </w:trPr>
         <w:tc>
           <w:tcPr>
             <w:tcW w:type="dxa" w:w="2834"/>
@@ -8568,6 +8786,9 @@
         </w:tc>
       </w:tr>
       <w:tr>
+        <w:trPr>
+          <w:cantSplit w:val="true"/>
+        </w:trPr>
         <w:tc>
           <w:tcPr>
             <w:tcW w:type="dxa" w:w="2834"/>
@@ -8666,6 +8887,9 @@
         </w:tc>
       </w:tr>
       <w:tr>
+        <w:trPr>
+          <w:cantSplit w:val="true"/>
+        </w:trPr>
         <w:tc>
           <w:tcPr>
             <w:tcW w:type="dxa" w:w="2834"/>
@@ -8764,6 +8988,9 @@
         </w:tc>
       </w:tr>
       <w:tr>
+        <w:trPr>
+          <w:cantSplit w:val="true"/>
+        </w:trPr>
         <w:tc>
           <w:tcPr>
             <w:tcW w:type="dxa" w:w="2834"/>
@@ -8862,6 +9089,9 @@
         </w:tc>
       </w:tr>
       <w:tr>
+        <w:trPr>
+          <w:cantSplit w:val="true"/>
+        </w:trPr>
         <w:tc>
           <w:tcPr>
             <w:tcW w:type="dxa" w:w="2834"/>
@@ -8960,6 +9190,9 @@
         </w:tc>
       </w:tr>
       <w:tr>
+        <w:trPr>
+          <w:cantSplit w:val="true"/>
+        </w:trPr>
         <w:tc>
           <w:tcPr>
             <w:tcW w:type="dxa" w:w="2834"/>
@@ -9058,6 +9291,9 @@
         </w:tc>
       </w:tr>
       <w:tr>
+        <w:trPr>
+          <w:cantSplit w:val="true"/>
+        </w:trPr>
         <w:tc>
           <w:tcPr>
             <w:tcW w:type="dxa" w:w="2834"/>
@@ -9156,6 +9392,9 @@
         </w:tc>
       </w:tr>
       <w:tr>
+        <w:trPr>
+          <w:cantSplit w:val="true"/>
+        </w:trPr>
         <w:tc>
           <w:tcPr>
             <w:tcW w:type="dxa" w:w="2834"/>
@@ -9254,6 +9493,9 @@
         </w:tc>
       </w:tr>
       <w:tr>
+        <w:trPr>
+          <w:cantSplit w:val="true"/>
+        </w:trPr>
         <w:tc>
           <w:tcPr>
             <w:tcW w:type="dxa" w:w="2834"/>
@@ -9352,6 +9594,9 @@
         </w:tc>
       </w:tr>
       <w:tr>
+        <w:trPr>
+          <w:cantSplit w:val="true"/>
+        </w:trPr>
         <w:tc>
           <w:tcPr>
             <w:tcW w:type="dxa" w:w="2834"/>
@@ -9450,6 +9695,9 @@
         </w:tc>
       </w:tr>
       <w:tr>
+        <w:trPr>
+          <w:cantSplit w:val="true"/>
+        </w:trPr>
         <w:tc>
           <w:tcPr>
             <w:tcW w:type="dxa" w:w="2834"/>
@@ -9548,6 +9796,9 @@
         </w:tc>
       </w:tr>
       <w:tr>
+        <w:trPr>
+          <w:cantSplit w:val="true"/>
+        </w:trPr>
         <w:tc>
           <w:tcPr>
             <w:tcW w:type="dxa" w:w="2834"/>
@@ -9646,6 +9897,9 @@
         </w:tc>
       </w:tr>
       <w:tr>
+        <w:trPr>
+          <w:cantSplit w:val="true"/>
+        </w:trPr>
         <w:tc>
           <w:tcPr>
             <w:tcW w:type="dxa" w:w="2834"/>
@@ -9744,6 +9998,9 @@
         </w:tc>
       </w:tr>
       <w:tr>
+        <w:trPr>
+          <w:cantSplit w:val="true"/>
+        </w:trPr>
         <w:tc>
           <w:tcPr>
             <w:tcW w:type="dxa" w:w="2834"/>
@@ -9842,6 +10099,9 @@
         </w:tc>
       </w:tr>
       <w:tr>
+        <w:trPr>
+          <w:cantSplit w:val="true"/>
+        </w:trPr>
         <w:tc>
           <w:tcPr>
             <w:tcW w:type="dxa" w:w="2834"/>
@@ -9940,6 +10200,9 @@
         </w:tc>
       </w:tr>
       <w:tr>
+        <w:trPr>
+          <w:cantSplit w:val="true"/>
+        </w:trPr>
         <w:tc>
           <w:tcPr>
             <w:tcW w:type="dxa" w:w="2834"/>
@@ -10046,6 +10309,7 @@
     <w:p>
       <w:pPr>
         <w:pStyle w:val="Heading2"/>
+        <w:keepNext/>
       </w:pPr>
       <w:r>
         <w:rPr>
@@ -10070,6 +10334,7 @@
       <w:tr>
         <w:trPr>
           <w:tblHeader w:val="true"/>
+          <w:cantSplit w:val="true"/>
         </w:trPr>
         <w:tc>
           <w:tcPr>
@@ -10148,6 +10413,9 @@
         </w:tc>
       </w:tr>
       <w:tr>
+        <w:trPr>
+          <w:cantSplit w:val="true"/>
+        </w:trPr>
         <w:tc>
           <w:tcPr>
             <w:tcW w:type="dxa" w:w="2834"/>
@@ -10222,6 +10490,9 @@
         </w:tc>
       </w:tr>
       <w:tr>
+        <w:trPr>
+          <w:cantSplit w:val="true"/>
+        </w:trPr>
         <w:tc>
           <w:tcPr>
             <w:tcW w:type="dxa" w:w="2834"/>
@@ -10296,6 +10567,9 @@
         </w:tc>
       </w:tr>
       <w:tr>
+        <w:trPr>
+          <w:cantSplit w:val="true"/>
+        </w:trPr>
         <w:tc>
           <w:tcPr>
             <w:tcW w:type="dxa" w:w="2834"/>
@@ -10370,6 +10644,9 @@
         </w:tc>
       </w:tr>
       <w:tr>
+        <w:trPr>
+          <w:cantSplit w:val="true"/>
+        </w:trPr>
         <w:tc>
           <w:tcPr>
             <w:tcW w:type="dxa" w:w="2834"/>
@@ -10444,6 +10721,9 @@
         </w:tc>
       </w:tr>
       <w:tr>
+        <w:trPr>
+          <w:cantSplit w:val="true"/>
+        </w:trPr>
         <w:tc>
           <w:tcPr>
             <w:tcW w:type="dxa" w:w="2834"/>
@@ -10518,6 +10798,9 @@
         </w:tc>
       </w:tr>
       <w:tr>
+        <w:trPr>
+          <w:cantSplit w:val="true"/>
+        </w:trPr>
         <w:tc>
           <w:tcPr>
             <w:tcW w:type="dxa" w:w="2834"/>
@@ -10592,6 +10875,9 @@
         </w:tc>
       </w:tr>
       <w:tr>
+        <w:trPr>
+          <w:cantSplit w:val="true"/>
+        </w:trPr>
         <w:tc>
           <w:tcPr>
             <w:tcW w:type="dxa" w:w="2834"/>
@@ -10666,6 +10952,9 @@
         </w:tc>
       </w:tr>
       <w:tr>
+        <w:trPr>
+          <w:cantSplit w:val="true"/>
+        </w:trPr>
         <w:tc>
           <w:tcPr>
             <w:tcW w:type="dxa" w:w="2834"/>
@@ -10740,6 +11029,9 @@
         </w:tc>
       </w:tr>
       <w:tr>
+        <w:trPr>
+          <w:cantSplit w:val="true"/>
+        </w:trPr>
         <w:tc>
           <w:tcPr>
             <w:tcW w:type="dxa" w:w="2834"/>
@@ -10814,6 +11106,9 @@
         </w:tc>
       </w:tr>
       <w:tr>
+        <w:trPr>
+          <w:cantSplit w:val="true"/>
+        </w:trPr>
         <w:tc>
           <w:tcPr>
             <w:tcW w:type="dxa" w:w="2834"/>
@@ -10888,6 +11183,9 @@
         </w:tc>
       </w:tr>
       <w:tr>
+        <w:trPr>
+          <w:cantSplit w:val="true"/>
+        </w:trPr>
         <w:tc>
           <w:tcPr>
             <w:tcW w:type="dxa" w:w="2834"/>
@@ -10962,6 +11260,9 @@
         </w:tc>
       </w:tr>
       <w:tr>
+        <w:trPr>
+          <w:cantSplit w:val="true"/>
+        </w:trPr>
         <w:tc>
           <w:tcPr>
             <w:tcW w:type="dxa" w:w="2834"/>
@@ -11036,6 +11337,9 @@
         </w:tc>
       </w:tr>
       <w:tr>
+        <w:trPr>
+          <w:cantSplit w:val="true"/>
+        </w:trPr>
         <w:tc>
           <w:tcPr>
             <w:tcW w:type="dxa" w:w="2834"/>
@@ -11110,6 +11414,9 @@
         </w:tc>
       </w:tr>
       <w:tr>
+        <w:trPr>
+          <w:cantSplit w:val="true"/>
+        </w:trPr>
         <w:tc>
           <w:tcPr>
             <w:tcW w:type="dxa" w:w="2834"/>
@@ -11184,6 +11491,9 @@
         </w:tc>
       </w:tr>
       <w:tr>
+        <w:trPr>
+          <w:cantSplit w:val="true"/>
+        </w:trPr>
         <w:tc>
           <w:tcPr>
             <w:tcW w:type="dxa" w:w="2834"/>
@@ -11258,6 +11568,9 @@
         </w:tc>
       </w:tr>
       <w:tr>
+        <w:trPr>
+          <w:cantSplit w:val="true"/>
+        </w:trPr>
         <w:tc>
           <w:tcPr>
             <w:tcW w:type="dxa" w:w="2834"/>
@@ -11332,6 +11645,9 @@
         </w:tc>
       </w:tr>
       <w:tr>
+        <w:trPr>
+          <w:cantSplit w:val="true"/>
+        </w:trPr>
         <w:tc>
           <w:tcPr>
             <w:tcW w:type="dxa" w:w="2834"/>
@@ -11406,6 +11722,9 @@
         </w:tc>
       </w:tr>
       <w:tr>
+        <w:trPr>
+          <w:cantSplit w:val="true"/>
+        </w:trPr>
         <w:tc>
           <w:tcPr>
             <w:tcW w:type="dxa" w:w="2834"/>
@@ -11480,6 +11799,9 @@
         </w:tc>
       </w:tr>
       <w:tr>
+        <w:trPr>
+          <w:cantSplit w:val="true"/>
+        </w:trPr>
         <w:tc>
           <w:tcPr>
             <w:tcW w:type="dxa" w:w="2834"/>
@@ -11554,6 +11876,9 @@
         </w:tc>
       </w:tr>
       <w:tr>
+        <w:trPr>
+          <w:cantSplit w:val="true"/>
+        </w:trPr>
         <w:tc>
           <w:tcPr>
             <w:tcW w:type="dxa" w:w="2834"/>
@@ -11628,6 +11953,9 @@
         </w:tc>
       </w:tr>
       <w:tr>
+        <w:trPr>
+          <w:cantSplit w:val="true"/>
+        </w:trPr>
         <w:tc>
           <w:tcPr>
             <w:tcW w:type="dxa" w:w="2834"/>
@@ -11702,6 +12030,9 @@
         </w:tc>
       </w:tr>
       <w:tr>
+        <w:trPr>
+          <w:cantSplit w:val="true"/>
+        </w:trPr>
         <w:tc>
           <w:tcPr>
             <w:tcW w:type="dxa" w:w="2834"/>
@@ -11776,6 +12107,9 @@
         </w:tc>
       </w:tr>
       <w:tr>
+        <w:trPr>
+          <w:cantSplit w:val="true"/>
+        </w:trPr>
         <w:tc>
           <w:tcPr>
             <w:tcW w:type="dxa" w:w="2834"/>
@@ -11850,6 +12184,9 @@
         </w:tc>
       </w:tr>
       <w:tr>
+        <w:trPr>
+          <w:cantSplit w:val="true"/>
+        </w:trPr>
         <w:tc>
           <w:tcPr>
             <w:tcW w:type="dxa" w:w="2834"/>
@@ -11924,6 +12261,9 @@
         </w:tc>
       </w:tr>
       <w:tr>
+        <w:trPr>
+          <w:cantSplit w:val="true"/>
+        </w:trPr>
         <w:tc>
           <w:tcPr>
             <w:tcW w:type="dxa" w:w="2834"/>
@@ -11998,6 +12338,9 @@
         </w:tc>
       </w:tr>
       <w:tr>
+        <w:trPr>
+          <w:cantSplit w:val="true"/>
+        </w:trPr>
         <w:tc>
           <w:tcPr>
             <w:tcW w:type="dxa" w:w="2834"/>
@@ -12072,6 +12415,9 @@
         </w:tc>
       </w:tr>
       <w:tr>
+        <w:trPr>
+          <w:cantSplit w:val="true"/>
+        </w:trPr>
         <w:tc>
           <w:tcPr>
             <w:tcW w:type="dxa" w:w="2834"/>
@@ -12146,6 +12492,9 @@
         </w:tc>
       </w:tr>
       <w:tr>
+        <w:trPr>
+          <w:cantSplit w:val="true"/>
+        </w:trPr>
         <w:tc>
           <w:tcPr>
             <w:tcW w:type="dxa" w:w="2834"/>
@@ -12220,6 +12569,9 @@
         </w:tc>
       </w:tr>
       <w:tr>
+        <w:trPr>
+          <w:cantSplit w:val="true"/>
+        </w:trPr>
         <w:tc>
           <w:tcPr>
             <w:tcW w:type="dxa" w:w="2834"/>
@@ -12294,6 +12646,9 @@
         </w:tc>
       </w:tr>
       <w:tr>
+        <w:trPr>
+          <w:cantSplit w:val="true"/>
+        </w:trPr>
         <w:tc>
           <w:tcPr>
             <w:tcW w:type="dxa" w:w="2834"/>
@@ -12368,6 +12723,9 @@
         </w:tc>
       </w:tr>
       <w:tr>
+        <w:trPr>
+          <w:cantSplit w:val="true"/>
+        </w:trPr>
         <w:tc>
           <w:tcPr>
             <w:tcW w:type="dxa" w:w="2834"/>
@@ -12442,6 +12800,9 @@
         </w:tc>
       </w:tr>
       <w:tr>
+        <w:trPr>
+          <w:cantSplit w:val="true"/>
+        </w:trPr>
         <w:tc>
           <w:tcPr>
             <w:tcW w:type="dxa" w:w="2834"/>
@@ -12516,6 +12877,9 @@
         </w:tc>
       </w:tr>
       <w:tr>
+        <w:trPr>
+          <w:cantSplit w:val="true"/>
+        </w:trPr>
         <w:tc>
           <w:tcPr>
             <w:tcW w:type="dxa" w:w="2834"/>
@@ -12598,6 +12962,7 @@
     <w:p>
       <w:pPr>
         <w:pStyle w:val="Heading2"/>
+        <w:keepNext/>
       </w:pPr>
       <w:r>
         <w:rPr>
@@ -12607,48 +12972,69 @@
       </w:r>
     </w:p>
     <w:p>
+      <w:pPr>
+        <w:pStyle w:val="ListBullet"/>
+      </w:pPr>
       <w:r>
         <w:rPr>
           <w:rFonts w:ascii="Arial" w:hAnsi="Arial" w:eastAsia="Arial"/>
+          <w:sz w:val="16"/>
         </w:rPr>
-        <w:t>- Todos os 36 RN devem aparecer na Seção 1.</w:t>
+        <w:t>Todos os 36 RN devem aparecer na Seção 1.</w:t>
       </w:r>
     </w:p>
     <w:p>
+      <w:pPr>
+        <w:pStyle w:val="ListBullet"/>
+      </w:pPr>
       <w:r>
         <w:rPr>
           <w:rFonts w:ascii="Arial" w:hAnsi="Arial" w:eastAsia="Arial"/>
+          <w:sz w:val="16"/>
         </w:rPr>
-        <w:t>- Todos os 50 RF devem aparecer na Seção 2.</w:t>
+        <w:t>Todos os 50 RF devem aparecer na Seção 2.</w:t>
       </w:r>
     </w:p>
     <w:p>
+      <w:pPr>
+        <w:pStyle w:val="ListBullet"/>
+      </w:pPr>
       <w:r>
         <w:rPr>
           <w:rFonts w:ascii="Arial" w:hAnsi="Arial" w:eastAsia="Arial"/>
+          <w:sz w:val="16"/>
         </w:rPr>
-        <w:t>- Todos os 33 RNF normativos devem aparecer na Seção 3.</w:t>
+        <w:t>Todos os 33 RNF normativos devem aparecer na Seção 3.</w:t>
       </w:r>
     </w:p>
     <w:p>
+      <w:pPr>
+        <w:pStyle w:val="ListBullet"/>
+      </w:pPr>
       <w:r>
         <w:rPr>
           <w:rFonts w:ascii="Arial" w:hAnsi="Arial" w:eastAsia="Arial"/>
+          <w:sz w:val="16"/>
         </w:rPr>
-        <w:t>- Todos os 65 RT devem estar referenciados por pelo menos um RN/RF/RNF ou ser explicitamente classificados como infraestrutura transversal.</w:t>
+        <w:t>Todos os 65 RT devem estar referenciados por pelo menos um RN/RF/RNF ou ser explicitamente classificados como infraestrutura transversal.</w:t>
       </w:r>
     </w:p>
     <w:p>
+      <w:pPr>
+        <w:pStyle w:val="ListBullet"/>
+      </w:pPr>
       <w:r>
         <w:rPr>
           <w:rFonts w:ascii="Arial" w:hAnsi="Arial" w:eastAsia="Arial"/>
+          <w:sz w:val="16"/>
         </w:rPr>
-        <w:t>- Mudança material em qualquer camada exige revisão desta matriz e das evidências correspondentes.</w:t>
+        <w:t>Mudança material em qualquer camada exige revisão desta matriz e das evidências correspondentes.</w:t>
       </w:r>
     </w:p>
     <w:p>
       <w:pPr>
         <w:pStyle w:val="Heading2"/>
+        <w:keepNext/>
       </w:pPr>
       <w:r>
         <w:rPr>
@@ -12674,6 +13060,7 @@
       <w:tr>
         <w:trPr>
           <w:tblHeader w:val="true"/>
+          <w:cantSplit w:val="true"/>
         </w:trPr>
         <w:tc>
           <w:tcPr>
@@ -12777,6 +13164,9 @@
         </w:tc>
       </w:tr>
       <w:tr>
+        <w:trPr>
+          <w:cantSplit w:val="true"/>
+        </w:trPr>
         <w:tc>
           <w:tcPr>
             <w:tcW w:type="dxa" w:w="2834"/>
@@ -12883,6 +13273,7 @@
     <w:p>
       <w:pPr>
         <w:pStyle w:val="Heading2"/>
+        <w:keepNext/>
       </w:pPr>
       <w:r>
         <w:rPr>
@@ -12894,6 +13285,7 @@
     <w:p>
       <w:pPr>
         <w:pStyle w:val="Heading2"/>
+        <w:keepNext/>
       </w:pPr>
       <w:r>
         <w:rPr>
@@ -12919,6 +13311,7 @@
       <w:tr>
         <w:trPr>
           <w:tblHeader w:val="true"/>
+          <w:cantSplit w:val="true"/>
         </w:trPr>
         <w:tc>
           <w:tcPr>
@@ -13022,6 +13415,9 @@
         </w:tc>
       </w:tr>
       <w:tr>
+        <w:trPr>
+          <w:cantSplit w:val="true"/>
+        </w:trPr>
         <w:tc>
           <w:tcPr>
             <w:tcW w:type="dxa" w:w="2834"/>
@@ -13128,6 +13524,9 @@
         </w:tc>
       </w:tr>
       <w:tr>
+        <w:trPr>
+          <w:cantSplit w:val="true"/>
+        </w:trPr>
         <w:tc>
           <w:tcPr>
             <w:tcW w:type="dxa" w:w="2834"/>
@@ -13241,6 +13640,9 @@
         </w:tc>
       </w:tr>
       <w:tr>
+        <w:trPr>
+          <w:cantSplit w:val="true"/>
+        </w:trPr>
         <w:tc>
           <w:tcPr>
             <w:tcW w:type="dxa" w:w="2834"/>
@@ -13382,6 +13784,9 @@
         </w:tc>
       </w:tr>
       <w:tr>
+        <w:trPr>
+          <w:cantSplit w:val="true"/>
+        </w:trPr>
         <w:tc>
           <w:tcPr>
             <w:tcW w:type="dxa" w:w="2834"/>
@@ -13488,6 +13893,9 @@
         </w:tc>
       </w:tr>
       <w:tr>
+        <w:trPr>
+          <w:cantSplit w:val="true"/>
+        </w:trPr>
         <w:tc>
           <w:tcPr>
             <w:tcW w:type="dxa" w:w="2834"/>
@@ -13601,6 +14009,9 @@
         </w:tc>
       </w:tr>
       <w:tr>
+        <w:trPr>
+          <w:cantSplit w:val="true"/>
+        </w:trPr>
         <w:tc>
           <w:tcPr>
             <w:tcW w:type="dxa" w:w="2834"/>
@@ -13722,6 +14133,7 @@
     <w:p>
       <w:pPr>
         <w:pStyle w:val="Heading2"/>
+        <w:keepNext/>
       </w:pPr>
       <w:r>
         <w:rPr>
@@ -13746,6 +14158,7 @@
       <w:tr>
         <w:trPr>
           <w:tblHeader w:val="true"/>
+          <w:cantSplit w:val="true"/>
         </w:trPr>
         <w:tc>
           <w:tcPr>
@@ -13824,6 +14237,9 @@
         </w:tc>
       </w:tr>
       <w:tr>
+        <w:trPr>
+          <w:cantSplit w:val="true"/>
+        </w:trPr>
         <w:tc>
           <w:tcPr>
             <w:tcW w:type="dxa" w:w="2834"/>
@@ -13906,6 +14322,9 @@
         </w:tc>
       </w:tr>
       <w:tr>
+        <w:trPr>
+          <w:cantSplit w:val="true"/>
+        </w:trPr>
         <w:tc>
           <w:tcPr>
             <w:tcW w:type="dxa" w:w="2834"/>
@@ -13988,6 +14407,9 @@
         </w:tc>
       </w:tr>
       <w:tr>
+        <w:trPr>
+          <w:cantSplit w:val="true"/>
+        </w:trPr>
         <w:tc>
           <w:tcPr>
             <w:tcW w:type="dxa" w:w="2834"/>
@@ -14070,6 +14492,9 @@
         </w:tc>
       </w:tr>
       <w:tr>
+        <w:trPr>
+          <w:cantSplit w:val="true"/>
+        </w:trPr>
         <w:tc>
           <w:tcPr>
             <w:tcW w:type="dxa" w:w="2834"/>
@@ -14152,6 +14577,9 @@
         </w:tc>
       </w:tr>
       <w:tr>
+        <w:trPr>
+          <w:cantSplit w:val="true"/>
+        </w:trPr>
         <w:tc>
           <w:tcPr>
             <w:tcW w:type="dxa" w:w="2834"/>
@@ -14257,6 +14685,7 @@
     <w:p>
       <w:pPr>
         <w:pStyle w:val="Heading2"/>
+        <w:keepNext/>
       </w:pPr>
       <w:r>
         <w:rPr>

</xml_diff>

<commit_message>
docs(requisitos): finalizar baseline institucional v1.1
</commit_message>
<xml_diff>
--- a/Documentos/Requisitos/05_Matriz_Rastreabilidade_Requisitos_Jornada_v1.1.docx
+++ b/Documentos/Requisitos/05_Matriz_Rastreabilidade_Requisitos_Jornada_v1.1.docx
@@ -8,10 +8,7 @@
         <w:keepNext/>
       </w:pPr>
       <w:r>
-        <w:rPr>
-          <w:rFonts w:ascii="Arial" w:hAnsi="Arial" w:eastAsia="Arial"/>
-        </w:rPr>
-        <w:t>Matriz de Rastreabilidade - Jornada do Cidadão - Fase 1 de Requisitos - Jornada do Cidadão - Fase 1</w:t>
+        <w:t>Matriz de Rastreabilidade - Jornada do Cidadão - Fase 1</w:t>
       </w:r>
     </w:p>
     <w:p>

</xml_diff>